<commit_message>
rapport et autres interface web
</commit_message>
<xml_diff>
--- a/rapport-couverture.docx
+++ b/rapport-couverture.docx
@@ -586,39 +586,17 @@
                                 <w:szCs w:val="22"/>
                                 <w:lang w:val="fr-FR"/>
                               </w:rPr>
-                              <w:t>PO-</w:t>
-                            </w:r>
-                            <w:proofErr w:type="gramStart"/>
-                            <w:r>
-                              <w:rPr>
-                                <w:rFonts w:ascii="Times New Roman" w:hAnsi="Times New Roman" w:cs="Times New Roman"/>
-                                <w:color w:val="000000" w:themeColor="text1"/>
-                                <w:sz w:val="22"/>
-                                <w:szCs w:val="22"/>
-                                <w:lang w:val="fr-FR"/>
-                              </w:rPr>
-                              <w:t>Box</w:t>
-                            </w:r>
-                            <w:r>
-                              <w:rPr>
-                                <w:rFonts w:ascii="Times New Roman" w:hAnsi="Times New Roman" w:cs="Times New Roman"/>
-                                <w:color w:val="000000" w:themeColor="text1"/>
-                                <w:sz w:val="22"/>
-                                <w:szCs w:val="22"/>
-                                <w:lang w:val="fr-FR"/>
-                              </w:rPr>
-                              <w:t>:</w:t>
-                            </w:r>
-                            <w:proofErr w:type="gramEnd"/>
-                            <w:r>
-                              <w:rPr>
-                                <w:rFonts w:ascii="Times New Roman" w:hAnsi="Times New Roman" w:cs="Times New Roman"/>
-                                <w:color w:val="000000" w:themeColor="text1"/>
-                                <w:sz w:val="22"/>
-                                <w:szCs w:val="22"/>
-                                <w:lang w:val="fr-FR"/>
-                              </w:rPr>
-                              <w:t xml:space="preserve"> 8698 DOUALA</w:t>
+                              <w:t>PO-Box</w:t>
+                            </w:r>
+                            <w:r>
+                              <w:rPr>
+                                <w:rFonts w:ascii="Times New Roman" w:hAnsi="Times New Roman" w:cs="Times New Roman"/>
+                                <w:color w:val="000000" w:themeColor="text1"/>
+                                <w:sz w:val="22"/>
+                                <w:szCs w:val="22"/>
+                                <w:lang w:val="fr-FR"/>
+                              </w:rPr>
+                              <w:t>: 8698 DOUALA</w:t>
                             </w:r>
                           </w:p>
                           <w:p>
@@ -633,7 +611,6 @@
                                 <w:lang w:val="fr-FR"/>
                               </w:rPr>
                             </w:pPr>
-                            <w:proofErr w:type="gramStart"/>
                             <w:r>
                               <w:rPr>
                                 <w:rFonts w:ascii="Times New Roman" w:hAnsi="Times New Roman" w:cs="Times New Roman"/>
@@ -652,18 +629,7 @@
                                 <w:szCs w:val="22"/>
                                 <w:lang w:val="fr-FR"/>
                               </w:rPr>
-                              <w:t>:</w:t>
-                            </w:r>
-                            <w:proofErr w:type="gramEnd"/>
-                            <w:r>
-                              <w:rPr>
-                                <w:rFonts w:ascii="Times New Roman" w:hAnsi="Times New Roman" w:cs="Times New Roman"/>
-                                <w:color w:val="000000" w:themeColor="text1"/>
-                                <w:sz w:val="22"/>
-                                <w:szCs w:val="22"/>
-                                <w:lang w:val="fr-FR"/>
-                              </w:rPr>
-                              <w:t xml:space="preserve"> (237) 233 40 24 82</w:t>
+                              <w:t>: (237) 233 40 24 82</w:t>
                             </w:r>
                           </w:p>
                           <w:p>
@@ -1042,39 +1008,17 @@
                           <w:szCs w:val="22"/>
                           <w:lang w:val="fr-FR"/>
                         </w:rPr>
-                        <w:t>PO-</w:t>
-                      </w:r>
-                      <w:proofErr w:type="gramStart"/>
-                      <w:r>
-                        <w:rPr>
-                          <w:rFonts w:ascii="Times New Roman" w:hAnsi="Times New Roman" w:cs="Times New Roman"/>
-                          <w:color w:val="000000" w:themeColor="text1"/>
-                          <w:sz w:val="22"/>
-                          <w:szCs w:val="22"/>
-                          <w:lang w:val="fr-FR"/>
-                        </w:rPr>
-                        <w:t>Box</w:t>
-                      </w:r>
-                      <w:r>
-                        <w:rPr>
-                          <w:rFonts w:ascii="Times New Roman" w:hAnsi="Times New Roman" w:cs="Times New Roman"/>
-                          <w:color w:val="000000" w:themeColor="text1"/>
-                          <w:sz w:val="22"/>
-                          <w:szCs w:val="22"/>
-                          <w:lang w:val="fr-FR"/>
-                        </w:rPr>
-                        <w:t>:</w:t>
-                      </w:r>
-                      <w:proofErr w:type="gramEnd"/>
-                      <w:r>
-                        <w:rPr>
-                          <w:rFonts w:ascii="Times New Roman" w:hAnsi="Times New Roman" w:cs="Times New Roman"/>
-                          <w:color w:val="000000" w:themeColor="text1"/>
-                          <w:sz w:val="22"/>
-                          <w:szCs w:val="22"/>
-                          <w:lang w:val="fr-FR"/>
-                        </w:rPr>
-                        <w:t xml:space="preserve"> 8698 DOUALA</w:t>
+                        <w:t>PO-Box</w:t>
+                      </w:r>
+                      <w:r>
+                        <w:rPr>
+                          <w:rFonts w:ascii="Times New Roman" w:hAnsi="Times New Roman" w:cs="Times New Roman"/>
+                          <w:color w:val="000000" w:themeColor="text1"/>
+                          <w:sz w:val="22"/>
+                          <w:szCs w:val="22"/>
+                          <w:lang w:val="fr-FR"/>
+                        </w:rPr>
+                        <w:t>: 8698 DOUALA</w:t>
                       </w:r>
                     </w:p>
                     <w:p>
@@ -1089,7 +1033,6 @@
                           <w:lang w:val="fr-FR"/>
                         </w:rPr>
                       </w:pPr>
-                      <w:proofErr w:type="gramStart"/>
                       <w:r>
                         <w:rPr>
                           <w:rFonts w:ascii="Times New Roman" w:hAnsi="Times New Roman" w:cs="Times New Roman"/>
@@ -1108,18 +1051,7 @@
                           <w:szCs w:val="22"/>
                           <w:lang w:val="fr-FR"/>
                         </w:rPr>
-                        <w:t>:</w:t>
-                      </w:r>
-                      <w:proofErr w:type="gramEnd"/>
-                      <w:r>
-                        <w:rPr>
-                          <w:rFonts w:ascii="Times New Roman" w:hAnsi="Times New Roman" w:cs="Times New Roman"/>
-                          <w:color w:val="000000" w:themeColor="text1"/>
-                          <w:sz w:val="22"/>
-                          <w:szCs w:val="22"/>
-                          <w:lang w:val="fr-FR"/>
-                        </w:rPr>
-                        <w:t xml:space="preserve"> (237) 233 40 24 82</w:t>
+                        <w:t>: (237) 233 40 24 82</w:t>
                       </w:r>
                     </w:p>
                     <w:p>
@@ -2102,7 +2034,6 @@
                                 <w:lang w:val="fr-FR"/>
                               </w:rPr>
                             </w:pPr>
-                            <w:proofErr w:type="gramStart"/>
                             <w:r>
                               <w:rPr>
                                 <w:rFonts w:ascii="Times New Roman" w:hAnsi="Times New Roman" w:cs="Times New Roman"/>
@@ -2113,25 +2044,22 @@
                                 <w:u w:val="single"/>
                                 <w:lang w:val="fr-FR"/>
                               </w:rPr>
-                              <w:t>THEME:</w:t>
-                            </w:r>
-                            <w:proofErr w:type="gramEnd"/>
-                            <w:r>
+                              <w:t xml:space="preserve">THEME: </w:t>
+                            </w:r>
+                          </w:p>
+                          <w:p>
+                            <w:pPr>
+                              <w:jc w:val="center"/>
                               <w:rPr>
                                 <w:rFonts w:ascii="Times New Roman" w:hAnsi="Times New Roman" w:cs="Times New Roman"/>
                                 <w:b/>
                                 <w:bCs/>
                                 <w:sz w:val="28"/>
                                 <w:szCs w:val="28"/>
-                                <w:u w:val="single"/>
-                                <w:lang w:val="fr-FR"/>
-                              </w:rPr>
-                              <w:t xml:space="preserve"> </w:t>
-                            </w:r>
-                          </w:p>
-                          <w:p>
-                            <w:pPr>
-                              <w:jc w:val="center"/>
+                                <w:lang w:val="fr-FR"/>
+                              </w:rPr>
+                            </w:pPr>
+                            <w:r>
                               <w:rPr>
                                 <w:rFonts w:ascii="Times New Roman" w:hAnsi="Times New Roman" w:cs="Times New Roman"/>
                                 <w:b/>
@@ -2140,7 +2068,8 @@
                                 <w:szCs w:val="28"/>
                                 <w:lang w:val="fr-FR"/>
                               </w:rPr>
-                            </w:pPr>
+                              <w:t>MISE EN PLACE D'UN</w:t>
+                            </w:r>
                             <w:r>
                               <w:rPr>
                                 <w:rFonts w:ascii="Times New Roman" w:hAnsi="Times New Roman" w:cs="Times New Roman"/>
@@ -2150,7 +2079,106 @@
                                 <w:szCs w:val="28"/>
                                 <w:lang w:val="fr-FR"/>
                               </w:rPr>
-                              <w:t>MISE EN PLACE D'UN OUTIL WEB POUR LA GESTION ET LE SUIVI DES STOCKS DE PHARMACIE HOSPITALIERE : CAS DE L’HOPITAL LAQUINTINIE</w:t>
+                              <w:t xml:space="preserve">E </w:t>
+                            </w:r>
+                            <w:r>
+                              <w:rPr>
+                                <w:rFonts w:ascii="Times New Roman" w:hAnsi="Times New Roman" w:cs="Times New Roman"/>
+                                <w:b/>
+                                <w:bCs/>
+                                <w:sz w:val="28"/>
+                                <w:szCs w:val="28"/>
+                                <w:lang w:val="fr-FR"/>
+                              </w:rPr>
+                              <w:t>A</w:t>
+                            </w:r>
+                            <w:r>
+                              <w:rPr>
+                                <w:rFonts w:ascii="Times New Roman" w:hAnsi="Times New Roman" w:cs="Times New Roman"/>
+                                <w:b/>
+                                <w:bCs/>
+                                <w:sz w:val="28"/>
+                                <w:szCs w:val="28"/>
+                                <w:lang w:val="fr-FR"/>
+                              </w:rPr>
+                              <w:t xml:space="preserve">PPLICATION </w:t>
+                            </w:r>
+                            <w:r>
+                              <w:rPr>
+                                <w:rFonts w:ascii="Times New Roman" w:hAnsi="Times New Roman" w:cs="Times New Roman"/>
+                                <w:b/>
+                                <w:bCs/>
+                                <w:sz w:val="28"/>
+                                <w:szCs w:val="28"/>
+                                <w:lang w:val="fr-FR"/>
+                              </w:rPr>
+                              <w:t xml:space="preserve">WEB </w:t>
+                            </w:r>
+                            <w:r>
+                              <w:rPr>
+                                <w:rFonts w:ascii="Times New Roman" w:hAnsi="Times New Roman" w:cs="Times New Roman"/>
+                                <w:b/>
+                                <w:bCs/>
+                                <w:sz w:val="28"/>
+                                <w:szCs w:val="28"/>
+                                <w:lang w:val="fr-FR"/>
+                              </w:rPr>
+                              <w:t>DE</w:t>
+                            </w:r>
+                            <w:r>
+                              <w:rPr>
+                                <w:rFonts w:ascii="Times New Roman" w:hAnsi="Times New Roman" w:cs="Times New Roman"/>
+                                <w:b/>
+                                <w:bCs/>
+                                <w:sz w:val="28"/>
+                                <w:szCs w:val="28"/>
+                                <w:lang w:val="fr-FR"/>
+                              </w:rPr>
+                              <w:t xml:space="preserve"> GESTION ET</w:t>
+                            </w:r>
+                            <w:r>
+                              <w:rPr>
+                                <w:rFonts w:ascii="Times New Roman" w:hAnsi="Times New Roman" w:cs="Times New Roman"/>
+                                <w:b/>
+                                <w:bCs/>
+                                <w:sz w:val="28"/>
+                                <w:szCs w:val="28"/>
+                                <w:lang w:val="fr-FR"/>
+                              </w:rPr>
+                              <w:t xml:space="preserve"> </w:t>
+                            </w:r>
+                            <w:r>
+                              <w:rPr>
+                                <w:rFonts w:ascii="Times New Roman" w:hAnsi="Times New Roman" w:cs="Times New Roman"/>
+                                <w:b/>
+                                <w:bCs/>
+                                <w:sz w:val="28"/>
+                                <w:szCs w:val="28"/>
+                                <w:lang w:val="fr-FR"/>
+                              </w:rPr>
+                              <w:t>SUIVI DES STOCKS D</w:t>
+                            </w:r>
+                            <w:r>
+                              <w:rPr>
+                                <w:rFonts w:ascii="Times New Roman" w:hAnsi="Times New Roman" w:cs="Times New Roman"/>
+                                <w:b/>
+                                <w:bCs/>
+                                <w:sz w:val="28"/>
+                                <w:szCs w:val="28"/>
+                                <w:lang w:val="fr-FR"/>
+                              </w:rPr>
+                              <w:t>ANS UNE</w:t>
+                            </w:r>
+                            <w:r>
+                              <w:rPr>
+                                <w:rFonts w:ascii="Times New Roman" w:hAnsi="Times New Roman" w:cs="Times New Roman"/>
+                                <w:b/>
+                                <w:bCs/>
+                                <w:sz w:val="28"/>
+                                <w:szCs w:val="28"/>
+                                <w:lang w:val="fr-FR"/>
+                              </w:rPr>
+                              <w:t xml:space="preserve"> PHARMACIE HOSPITALIERE : CAS DE L’HOPITAL LAQUINTINIE</w:t>
                             </w:r>
                           </w:p>
                         </w:txbxContent>
@@ -2216,7 +2244,6 @@
                           <w:lang w:val="fr-FR"/>
                         </w:rPr>
                       </w:pPr>
-                      <w:proofErr w:type="gramStart"/>
                       <w:r>
                         <w:rPr>
                           <w:rFonts w:ascii="Times New Roman" w:hAnsi="Times New Roman" w:cs="Times New Roman"/>
@@ -2227,20 +2254,7 @@
                           <w:u w:val="single"/>
                           <w:lang w:val="fr-FR"/>
                         </w:rPr>
-                        <w:t>THEME:</w:t>
-                      </w:r>
-                      <w:proofErr w:type="gramEnd"/>
-                      <w:r>
-                        <w:rPr>
-                          <w:rFonts w:ascii="Times New Roman" w:hAnsi="Times New Roman" w:cs="Times New Roman"/>
-                          <w:b/>
-                          <w:bCs/>
-                          <w:sz w:val="28"/>
-                          <w:szCs w:val="28"/>
-                          <w:u w:val="single"/>
-                          <w:lang w:val="fr-FR"/>
-                        </w:rPr>
-                        <w:t xml:space="preserve"> </w:t>
+                        <w:t xml:space="preserve">THEME: </w:t>
                       </w:r>
                     </w:p>
                     <w:p>
@@ -2264,7 +2278,117 @@
                           <w:szCs w:val="28"/>
                           <w:lang w:val="fr-FR"/>
                         </w:rPr>
-                        <w:t>MISE EN PLACE D'UN OUTIL WEB POUR LA GESTION ET LE SUIVI DES STOCKS DE PHARMACIE HOSPITALIERE : CAS DE L’HOPITAL LAQUINTINIE</w:t>
+                        <w:t>MISE EN PLACE D'UN</w:t>
+                      </w:r>
+                      <w:r>
+                        <w:rPr>
+                          <w:rFonts w:ascii="Times New Roman" w:hAnsi="Times New Roman" w:cs="Times New Roman"/>
+                          <w:b/>
+                          <w:bCs/>
+                          <w:sz w:val="28"/>
+                          <w:szCs w:val="28"/>
+                          <w:lang w:val="fr-FR"/>
+                        </w:rPr>
+                        <w:t xml:space="preserve">E </w:t>
+                      </w:r>
+                      <w:r>
+                        <w:rPr>
+                          <w:rFonts w:ascii="Times New Roman" w:hAnsi="Times New Roman" w:cs="Times New Roman"/>
+                          <w:b/>
+                          <w:bCs/>
+                          <w:sz w:val="28"/>
+                          <w:szCs w:val="28"/>
+                          <w:lang w:val="fr-FR"/>
+                        </w:rPr>
+                        <w:t>A</w:t>
+                      </w:r>
+                      <w:r>
+                        <w:rPr>
+                          <w:rFonts w:ascii="Times New Roman" w:hAnsi="Times New Roman" w:cs="Times New Roman"/>
+                          <w:b/>
+                          <w:bCs/>
+                          <w:sz w:val="28"/>
+                          <w:szCs w:val="28"/>
+                          <w:lang w:val="fr-FR"/>
+                        </w:rPr>
+                        <w:t xml:space="preserve">PPLICATION </w:t>
+                      </w:r>
+                      <w:r>
+                        <w:rPr>
+                          <w:rFonts w:ascii="Times New Roman" w:hAnsi="Times New Roman" w:cs="Times New Roman"/>
+                          <w:b/>
+                          <w:bCs/>
+                          <w:sz w:val="28"/>
+                          <w:szCs w:val="28"/>
+                          <w:lang w:val="fr-FR"/>
+                        </w:rPr>
+                        <w:t xml:space="preserve">WEB </w:t>
+                      </w:r>
+                      <w:r>
+                        <w:rPr>
+                          <w:rFonts w:ascii="Times New Roman" w:hAnsi="Times New Roman" w:cs="Times New Roman"/>
+                          <w:b/>
+                          <w:bCs/>
+                          <w:sz w:val="28"/>
+                          <w:szCs w:val="28"/>
+                          <w:lang w:val="fr-FR"/>
+                        </w:rPr>
+                        <w:t>DE</w:t>
+                      </w:r>
+                      <w:r>
+                        <w:rPr>
+                          <w:rFonts w:ascii="Times New Roman" w:hAnsi="Times New Roman" w:cs="Times New Roman"/>
+                          <w:b/>
+                          <w:bCs/>
+                          <w:sz w:val="28"/>
+                          <w:szCs w:val="28"/>
+                          <w:lang w:val="fr-FR"/>
+                        </w:rPr>
+                        <w:t xml:space="preserve"> GESTION ET</w:t>
+                      </w:r>
+                      <w:r>
+                        <w:rPr>
+                          <w:rFonts w:ascii="Times New Roman" w:hAnsi="Times New Roman" w:cs="Times New Roman"/>
+                          <w:b/>
+                          <w:bCs/>
+                          <w:sz w:val="28"/>
+                          <w:szCs w:val="28"/>
+                          <w:lang w:val="fr-FR"/>
+                        </w:rPr>
+                        <w:t xml:space="preserve"> </w:t>
+                      </w:r>
+                      <w:r>
+                        <w:rPr>
+                          <w:rFonts w:ascii="Times New Roman" w:hAnsi="Times New Roman" w:cs="Times New Roman"/>
+                          <w:b/>
+                          <w:bCs/>
+                          <w:sz w:val="28"/>
+                          <w:szCs w:val="28"/>
+                          <w:lang w:val="fr-FR"/>
+                        </w:rPr>
+                        <w:t>SUIVI DES STOCKS D</w:t>
+                      </w:r>
+                      <w:r>
+                        <w:rPr>
+                          <w:rFonts w:ascii="Times New Roman" w:hAnsi="Times New Roman" w:cs="Times New Roman"/>
+                          <w:b/>
+                          <w:bCs/>
+                          <w:sz w:val="28"/>
+                          <w:szCs w:val="28"/>
+                          <w:lang w:val="fr-FR"/>
+                        </w:rPr>
+                        <w:t>ANS UNE</w:t>
+                      </w:r>
+                      <w:r>
+                        <w:rPr>
+                          <w:rFonts w:ascii="Times New Roman" w:hAnsi="Times New Roman" w:cs="Times New Roman"/>
+                          <w:b/>
+                          <w:bCs/>
+                          <w:sz w:val="28"/>
+                          <w:szCs w:val="28"/>
+                          <w:lang w:val="fr-FR"/>
+                        </w:rPr>
+                        <w:t xml:space="preserve"> PHARMACIE HOSPITALIERE : CAS DE L’HOPITAL LAQUINTINIE</w:t>
                       </w:r>
                     </w:p>
                   </w:txbxContent>
@@ -2880,7 +3004,6 @@
                                 <w:lang w:val="fr-FR"/>
                               </w:rPr>
                             </w:pPr>
-                            <w:proofErr w:type="spellStart"/>
                             <w:r>
                               <w:rPr>
                                 <w:rFonts w:ascii="Times New Roman" w:hAnsi="Times New Roman" w:cs="Times New Roman"/>
@@ -2900,7 +3023,6 @@
                               </w:rPr>
                               <w:t>mique</w:t>
                             </w:r>
-                            <w:proofErr w:type="spellEnd"/>
                             <w:r>
                               <w:rPr>
                                 <w:rFonts w:ascii="Times New Roman" w:hAnsi="Times New Roman" w:cs="Times New Roman"/>
@@ -3184,8 +3306,6 @@
                                 <w:szCs w:val="28"/>
                               </w:rPr>
                             </w:pPr>
-                            <w:proofErr w:type="spellStart"/>
-                            <w:proofErr w:type="gramStart"/>
                             <w:r>
                               <w:rPr>
                                 <w:rFonts w:ascii="Times New Roman" w:hAnsi="Times New Roman" w:cs="Times New Roman"/>
@@ -3193,19 +3313,8 @@
                                 <w:sz w:val="28"/>
                                 <w:szCs w:val="28"/>
                               </w:rPr>
-                              <w:t>Matricule</w:t>
-                            </w:r>
-                            <w:proofErr w:type="spellEnd"/>
-                            <w:r>
-                              <w:rPr>
-                                <w:rFonts w:ascii="Times New Roman" w:hAnsi="Times New Roman" w:cs="Times New Roman"/>
-                                <w:color w:val="000000" w:themeColor="text1"/>
-                                <w:sz w:val="28"/>
-                                <w:szCs w:val="28"/>
-                              </w:rPr>
-                              <w:t xml:space="preserve"> :</w:t>
-                            </w:r>
-                            <w:proofErr w:type="gramEnd"/>
+                              <w:t>Matricule :</w:t>
+                            </w:r>
                           </w:p>
                           <w:p>
                             <w:pPr>
@@ -3250,39 +3359,8 @@
                                 <w:sz w:val="28"/>
                                 <w:szCs w:val="28"/>
                               </w:rPr>
-                              <w:t xml:space="preserve">Sous </w:t>
-                            </w:r>
-                            <w:proofErr w:type="spellStart"/>
-                            <w:r>
-                              <w:rPr>
-                                <w:rFonts w:ascii="Times New Roman" w:hAnsi="Times New Roman" w:cs="Times New Roman"/>
-                                <w:color w:val="000000" w:themeColor="text1"/>
-                                <w:sz w:val="28"/>
-                                <w:szCs w:val="28"/>
-                              </w:rPr>
-                              <w:t>l’encardrement</w:t>
-                            </w:r>
-                            <w:proofErr w:type="spellEnd"/>
-                            <w:r>
-                              <w:rPr>
-                                <w:rFonts w:ascii="Times New Roman" w:hAnsi="Times New Roman" w:cs="Times New Roman"/>
-                                <w:color w:val="000000" w:themeColor="text1"/>
-                                <w:sz w:val="28"/>
-                                <w:szCs w:val="28"/>
-                              </w:rPr>
-                              <w:t xml:space="preserve"> </w:t>
-                            </w:r>
-                            <w:proofErr w:type="gramStart"/>
-                            <w:r>
-                              <w:rPr>
-                                <w:rFonts w:ascii="Times New Roman" w:hAnsi="Times New Roman" w:cs="Times New Roman"/>
-                                <w:color w:val="000000" w:themeColor="text1"/>
-                                <w:sz w:val="28"/>
-                                <w:szCs w:val="28"/>
-                              </w:rPr>
-                              <w:t>de :</w:t>
-                            </w:r>
-                            <w:proofErr w:type="gramEnd"/>
+                              <w:t>Sous l’encardrement de :</w:t>
+                            </w:r>
                           </w:p>
                         </w:txbxContent>
                       </wps:txbx>

</xml_diff>